<commit_message>
feat: update high-impact component priority plan and document combobox development status
</commit_message>
<xml_diff>
--- a/react_component_library_prd.docx
+++ b/react_component_library_prd.docx
@@ -249,7 +249,7 @@
               <w:rPr>
                 <w:sz w:val="18"/>
               </w:rPr>
-              <w:t>Draft v1.0</w:t>
+              <w:t>Draft v1.1 (Appendix C addendum, 2 July 2026)</w:t>
             </w:r>
           </w:p>
         </w:tc>
@@ -35483,6 +35483,272 @@
         </w:rPr>
         <w:br/>
         <w:t>/&gt;</w:t>
+      </w:r>
+    </w:p>
+    <w:p>
+      <w:pPr>
+        <w:pStyle w:val="Heading1"/>
+      </w:pPr>
+      <w:r>
+        <w:t xml:space="preserve">Appendix C. PRD Review Addendum (2 July 2026)</w:t>
+      </w:r>
+    </w:p>
+    <w:p>
+      <w:r>
+        <w:t xml:space="preserve">This appendix records a validation review of Draft v1.0 against the current dethink-components repository state and component-ecosystem developments through mid-2026. It does not change the P0/P1/P2 scope defined above; it lists corrections, inventory additions, and updated requirements to fold into the next full revision.</w:t>
+      </w:r>
+    </w:p>
+    <w:p>
+      <w:pPr>
+        <w:pStyle w:val="Heading2"/>
+      </w:pPr>
+      <w:r>
+        <w:t xml:space="preserve">C.1 Validation Findings</w:t>
+      </w:r>
+    </w:p>
+    <w:p>
+      <w:pPr>
+        <w:pStyle w:val="ListBullet"/>
+        <w:spacing w:after="40"/>
+      </w:pPr>
+      <w:r>
+        <w:t xml:space="preserve">Product name is resolved in practice: the implementation package is @dethink/components, superseding the "TBD UI" working name. Mark the Section 19 name decision resolved and update the @tbd-ui/* package names in Section 6.2.</w:t>
+      </w:r>
+    </w:p>
+    <w:p>
+      <w:pPr>
+        <w:pStyle w:val="ListBullet"/>
+        <w:spacing w:after="40"/>
+      </w:pPr>
+      <w:r>
+        <w:t xml:space="preserve">Monorepo structure diverges from Section 6.1: the actual repository uses a single packages/components package plus apps/storybook, apps/playground-vite, registry/items, and scripts. Either restate the multi-package layout (tokens/core/react/registry/blocks/icons) as a later split target or revise Section 6.1 to match the consolidated layout.</w:t>
+      </w:r>
+    </w:p>
+    <w:p>
+      <w:pPr>
+        <w:pStyle w:val="ListBullet"/>
+        <w:spacing w:after="40"/>
+      </w:pPr>
+      <w:r>
+        <w:t xml:space="preserve">Priority tables disagree in places: Section 7 lists the General category as P0 while Section 9.1 marks ButtonGroup, Kbd, and Code as P1; Section 16.1 omits NumberInput, Calendar, Collapsible, ScrollArea, and AspectRatio even though Appendix A includes them in P0. Reconcile Sections 7, 9, 16.1, and Appendix A into one canonical priority source.</w:t>
+      </w:r>
+    </w:p>
+    <w:p>
+      <w:pPr>
+        <w:pStyle w:val="ListBullet"/>
+        <w:spacing w:after="40"/>
+      </w:pPr>
+      <w:r>
+        <w:t xml:space="preserve">Delivery order has deliberately deviated from Appendix A: DateTimePicker and Timeline (both P1) and CardStack (not in the inventory) shipped early. docs/high-impact-component-priority.md now acts as the operative prioritization overlay; the PRD should reference it as the sequencing source of truth.</w:t>
+      </w:r>
+    </w:p>
+    <w:p>
+      <w:pPr>
+        <w:pStyle w:val="ListBullet"/>
+        <w:spacing w:after="40"/>
+      </w:pPr>
+      <w:r>
+        <w:t xml:space="preserve">CardStack exists in the implementation but is absent from the Section 7 inventory. Add it to Data Display (P2, showcase-oriented) or document it explicitly as an out-of-inventory exception.</w:t>
+      </w:r>
+    </w:p>
+    <w:p>
+      <w:pPr>
+        <w:pStyle w:val="ListBullet"/>
+        <w:spacing w:after="40"/>
+      </w:pPr>
+      <w:r>
+        <w:t xml:space="preserve">The Tailwind decision in Section 19 is resolved in practice: Tailwind v4 CSS-first is the default per repository conventions, with v3 compatibility only by explicit per-component exception.</w:t>
+      </w:r>
+    </w:p>
+    <w:p>
+      <w:pPr>
+        <w:pStyle w:val="ListBullet"/>
+        <w:spacing w:after="40"/>
+      </w:pPr>
+      <w:r>
+        <w:t xml:space="preserve">DateTimePicker shipped before Calendar, Popover, and the date/time suite existed. When DatePicker/DateRangePicker/TimePicker are built, extract a shared calendar and overlay core from the existing DateTimePicker instead of maintaining parallel implementations.</w:t>
+      </w:r>
+    </w:p>
+    <w:p>
+      <w:pPr>
+        <w:pStyle w:val="Heading2"/>
+      </w:pPr>
+      <w:r>
+        <w:t xml:space="preserve">C.2 Component Inventory Additions</w:t>
+      </w:r>
+    </w:p>
+    <w:p>
+      <w:pPr>
+        <w:pStyle w:val="ListBullet"/>
+        <w:spacing w:after="40"/>
+      </w:pPr>
+      <w:r>
+        <w:t xml:space="preserve">Toggle / ToggleGroup (P0/P1): pressed-state buttons with single or multiple selection for toolbars, formatting controls, view switchers, and segmented controls. Distinct from Switch (a setting) and ButtonGroup (layout grouping); currently missing from the inventory.</w:t>
+      </w:r>
+    </w:p>
+    <w:p>
+      <w:pPr>
+        <w:pStyle w:val="ListBullet"/>
+        <w:spacing w:after="40"/>
+      </w:pPr>
+      <w:r>
+        <w:t xml:space="preserve">Toolbar (P1): APG toolbar pattern with roving focus. A prerequisite for RichTextEditor and the DataTable filter toolbar, both of which currently imply it without naming it.</w:t>
+      </w:r>
+    </w:p>
+    <w:p>
+      <w:pPr>
+        <w:pStyle w:val="ListBullet"/>
+        <w:spacing w:after="40"/>
+      </w:pPr>
+      <w:r>
+        <w:t xml:space="preserve">InputGroup / InputAddon (P1): leading and trailing addons beyond simple prefix/suffix, such as attached buttons, selects, and copy actions on inputs.</w:t>
+      </w:r>
+    </w:p>
+    <w:p>
+      <w:pPr>
+        <w:pStyle w:val="ListBullet"/>
+        <w:spacing w:after="40"/>
+      </w:pPr>
+      <w:r>
+        <w:t xml:space="preserve">Meter (P2): capacity/quota display with native meter semantics, distinct from Progress which communicates task completion.</w:t>
+      </w:r>
+    </w:p>
+    <w:p>
+      <w:pPr>
+        <w:pStyle w:val="ListBullet"/>
+        <w:spacing w:after="40"/>
+      </w:pPr>
+      <w:r>
+        <w:t xml:space="preserve">SkipLink (P0 utility): referenced by the SidebarShell spec but missing as a standalone item; needed by every app-shell block.</w:t>
+      </w:r>
+    </w:p>
+    <w:p>
+      <w:pPr>
+        <w:pStyle w:val="ListBullet"/>
+        <w:spacing w:after="40"/>
+      </w:pPr>
+      <w:r>
+        <w:t xml:space="preserve">LiveRegion / Announcer (P0 utility): a shared polite/assertive announcement manager. Toast, Combobox filter results, DataTable sort and selection changes, and FileUpload progress all need one; without a shared utility each component will ship its own inconsistent live region.</w:t>
+      </w:r>
+    </w:p>
+    <w:p>
+      <w:pPr>
+        <w:pStyle w:val="Heading2"/>
+      </w:pPr>
+      <w:r>
+        <w:t xml:space="preserve">C.3 AI/Chat Component Updates</w:t>
+      </w:r>
+    </w:p>
+    <w:p>
+      <w:r>
+        <w:t xml:space="preserve">The Section 10 AI/chat list predates several patterns that became standard in AI-native interfaces during 2025-2026. Add the following to the AI/chat inventory:</w:t>
+      </w:r>
+    </w:p>
+    <w:p>
+      <w:pPr>
+        <w:pStyle w:val="ListBullet"/>
+        <w:spacing w:after="40"/>
+      </w:pPr>
+      <w:r>
+        <w:t xml:space="preserve">Response / StreamingMarkdown (P2): streaming-safe markdown rendering with incremental code-block highlighting. This is the hardest part of chat UI and should be a named component, not an implementation detail of ChatMessage.</w:t>
+      </w:r>
+    </w:p>
+    <w:p>
+      <w:pPr>
+        <w:pStyle w:val="ListBullet"/>
+        <w:spacing w:after="40"/>
+      </w:pPr>
+      <w:r>
+        <w:t xml:space="preserve">ReasoningDisclosure (P2): collapsible thinking-trace display for reasoning models, with streaming and duration states.</w:t>
+      </w:r>
+    </w:p>
+    <w:p>
+      <w:pPr>
+        <w:pStyle w:val="ListBullet"/>
+        <w:spacing w:after="40"/>
+      </w:pPr>
+      <w:r>
+        <w:t xml:space="preserve">ApprovalCard (P2): human-in-the-loop approve/deny UI for agentic tool calls; pairs with ToolCallCard.</w:t>
+      </w:r>
+    </w:p>
+    <w:p>
+      <w:pPr>
+        <w:pStyle w:val="ListBullet"/>
+        <w:spacing w:after="40"/>
+      </w:pPr>
+      <w:r>
+        <w:t xml:space="preserve">SuggestionChips (P2): prompt suggestions for empty states and follow-up turns.</w:t>
+      </w:r>
+    </w:p>
+    <w:p>
+      <w:pPr>
+        <w:pStyle w:val="ListBullet"/>
+        <w:spacing w:after="40"/>
+      </w:pPr>
+      <w:r>
+        <w:t xml:space="preserve">BranchNavigator (P2): previous/next navigation across regenerated message variants.</w:t>
+      </w:r>
+    </w:p>
+    <w:p>
+      <w:pPr>
+        <w:pStyle w:val="ListBullet"/>
+        <w:spacing w:after="40"/>
+      </w:pPr>
+      <w:r>
+        <w:t xml:space="preserve">CitationCard should additionally specify inline citation markers and a collapsible sources-list variant, since RAG answers cite inline as well as per-card.</w:t>
+      </w:r>
+    </w:p>
+    <w:p>
+      <w:pPr>
+        <w:pStyle w:val="Heading2"/>
+      </w:pPr>
+      <w:r>
+        <w:t xml:space="preserve">C.4 Standards and Requirements Updates</w:t>
+      </w:r>
+    </w:p>
+    <w:p>
+      <w:pPr>
+        <w:pStyle w:val="ListBullet"/>
+        <w:spacing w:after="40"/>
+      </w:pPr>
+      <w:r>
+        <w:t xml:space="preserve">Form validation: target the Standard Schema interface rather than Zod-only recipes, so Zod, Valibot, and ArkType all work with Form/Field validation adapters through one integration.</w:t>
+      </w:r>
+    </w:p>
+    <w:p>
+      <w:pPr>
+        <w:pStyle w:val="ListBullet"/>
+        <w:spacing w:after="40"/>
+      </w:pPr>
+      <w:r>
+        <w:t xml:space="preserve">Accessibility: European Accessibility Act enforcement began 28 June 2025. Add an EN 301 549 alignment note to Section 5.2; EAA readiness is a concrete differentiator for EU-facing SaaS customers.</w:t>
+      </w:r>
+    </w:p>
+    <w:p>
+      <w:pPr>
+        <w:pStyle w:val="ListBullet"/>
+        <w:spacing w:after="40"/>
+      </w:pPr>
+      <w:r>
+        <w:t xml:space="preserve">AI-readable docs: extend FR6 and Section 14 with concrete deliverables - an llms.txt/llms-full.txt for the docs site, per-component machine-readable metadata, and an MCP server exposing the registry so AI coding agents can search and install components directly.</w:t>
+      </w:r>
+    </w:p>
+    <w:p>
+      <w:pPr>
+        <w:pStyle w:val="ListBullet"/>
+        <w:spacing w:after="40"/>
+      </w:pPr>
+      <w:r>
+        <w:t xml:space="preserve">Native overlay primitives: track the HTML popover attribute and CSS anchor positioning as progressive-enhancement targets for Popover, Tooltip, and DropdownMenu, keeping library-based positioning as the baseline.</w:t>
+      </w:r>
+    </w:p>
+    <w:p>
+      <w:pPr>
+        <w:pStyle w:val="ListBullet"/>
+        <w:spacing w:after="40"/>
+      </w:pPr>
+      <w:r>
+        <w:t xml:space="preserve">Performance budgets: replace the qualitative Section 5.2 performance requirement with per-component budgets - gzipped size ceilings per registry item and interaction benchmarks for DataTable, virtualized lists, and message scrollers - enforced in CI.</w:t>
       </w:r>
     </w:p>
     <w:sectPr>

</xml_diff>